<commit_message>
fix: add Indian-context citations alongside foreign-only standards (IMS1, IMS5, HRM6)
- IMS1 (meeting information needs): pair NFPA 75 with NBC 2016 Part 4
- IMS5 (confidentiality/integrity/security of records): pair NFPA 75 with NBC 2016 Part 4
- HRM6 (safety and quality staff training): pair NIOSH/OSHA citations with
  Bio-Medical Waste Management Rules 2016, and NFPA 101 with NBC 2016 Part 4

NABH does not mandate one specific standard; these additions give the
Indian-context alternative alongside the existing foreign source rather
than replacing it, per the standing editorial rule.

Co-Authored-By: Claude Sonnet 5 <noreply@anthropic.com>
Claude-Session: https://claude.ai/code/session_01TPRLtLhmTCP5z94Q3FiE5v
</commit_message>
<xml_diff>
--- a/policies/build/chapters_v2/HRM/documents/HRM_Package_v2/HRM6/SOP_HRM6_safety_and_quality_related_staff_training.docx
+++ b/policies/build/chapters_v2/HRM/documents/HRM_Package_v2/HRM6/SOP_HRM6_safety_and_quality_related_staff_training.docx
@@ -321,34 +321,22 @@
     </w:p>
     <w:p>
       <w:r>
-        <w:t xml:space="preserve">HR In-Charge / Personnel Officer: </w:t>
-      </w:r>
-      <w:r>
-        <w:t>owns recruitment, training records, personal files and the day-to-day running of this policy, and keeps the required records current.</w:t>
+        <w:t xml:space="preserve">HR In-Charge / Personnel Officer: owns recruitment, training records, personal files and the day-to-day running of this policy, and keeps the required records current.</w:t>
       </w:r>
     </w:p>
     <w:p>
       <w:r>
-        <w:t xml:space="preserve">Medical Superintendent: </w:t>
-      </w:r>
-      <w:r>
-        <w:t>escalation point for any unresolved gap, and approves the workforce plan, contingency plan and credentialing/privileging decisions.</w:t>
+        <w:t xml:space="preserve">Medical Superintendent: escalation point for any unresolved gap, and approves the workforce plan, contingency plan and credentialing/privileging decisions.</w:t>
       </w:r>
     </w:p>
     <w:p>
       <w:r>
-        <w:t xml:space="preserve">Department Heads / Heads of Service: </w:t>
-      </w:r>
-      <w:r>
-        <w:t>identify their own department's staffing, training and credentialing needs, and support this policy's records at department level.</w:t>
+        <w:t xml:space="preserve">Department Heads / Heads of Service: identify their own department's staffing, training and credentialing needs, and support this policy's records at department level.</w:t>
       </w:r>
     </w:p>
     <w:p>
       <w:r>
-        <w:t xml:space="preserve">Quality Coordinator: </w:t>
-      </w:r>
-      <w:r>
-        <w:t>audits this policy periodically, checks records against the steps below, and flags gaps for corrective action.</w:t>
+        <w:t xml:space="preserve">Quality Coordinator: audits this policy periodically, checks records against the steps below, and flags gaps for corrective action.</w:t>
       </w:r>
     </w:p>
     <w:p>
@@ -480,6 +468,14 @@
     </w:p>
     <w:p>
       <w:pPr>
+        <w:pStyle w:val="ListParagraph"/>
+      </w:pPr>
+      <w:r>
+        <w:t>Ministry of Environment, Forest and Climate Change — Bio-Medical Waste Management Rules, 2016 (the applicable Indian regulatory reference alongside CDC/NIOSH/OSHA guidance for occupational safety and waste-handling training content).</w:t>
+      </w:r>
+    </w:p>
+    <w:p>
+      <w:pPr>
         <w:pStyle w:val="Heading2"/>
       </w:pPr>
       <w:r>
@@ -596,6 +592,14 @@
           <w:t>Centers for Disease Control and Prevention, National Institute for Occupational Safety and Health (NIOSH).</w:t>
         </w:r>
       </w:hyperlink>
+    </w:p>
+    <w:p>
+      <w:pPr>
+        <w:pStyle w:val="ListParagraph"/>
+      </w:pPr>
+      <w:r>
+        <w:t>Ministry of Environment, Forest and Climate Change — Bio-Medical Waste Management Rules, 2016 (the applicable Indian regulatory reference alongside CDC/NIOSH/OSHA guidance for occupational safety and waste-handling training content).</w:t>
+      </w:r>
     </w:p>
     <w:p>
       <w:pPr>
@@ -724,6 +728,14 @@
           <w:t>National Fire Protection Association. NFPA 101 — Life Safety Code.</w:t>
         </w:r>
       </w:hyperlink>
+    </w:p>
+    <w:p>
+      <w:pPr>
+        <w:pStyle w:val="ListParagraph"/>
+      </w:pPr>
+      <w:r>
+        <w:t>Bureau of Indian Standards — National Building Code of India 2016, Part 4: Fire and Life Safety (the applicable Indian reference alongside NFPA 101 for life-safety training content).</w:t>
+      </w:r>
     </w:p>
     <w:p>
       <w:pPr>

</xml_diff>